<commit_message>
docs(reports): Update certification and content pages
</commit_message>
<xml_diff>
--- a/report/insightswarm_content_and_certificate_pages.docx
+++ b/report/insightswarm_content_and_certificate_pages.docx
@@ -438,7 +438,6 @@
               </w:rPr>
               <w:t xml:space="preserve"> </w:t>
             </w:r>
-            <w:proofErr w:type="spellStart"/>
             <w:r>
               <w:rPr>
                 <w:b/>
@@ -447,7 +446,6 @@
               </w:rPr>
               <w:t>Ghawali</w:t>
             </w:r>
-            <w:proofErr w:type="spellEnd"/>
           </w:p>
           <w:p>
             <w:pPr>
@@ -519,7 +517,6 @@
                 <w:sz w:val="28"/>
               </w:rPr>
             </w:pPr>
-            <w:proofErr w:type="spellStart"/>
             <w:r>
               <w:rPr>
                 <w:b/>
@@ -527,17 +524,7 @@
                 <w:w w:val="105"/>
                 <w:sz w:val="28"/>
               </w:rPr>
-              <w:t>Roll.No</w:t>
-            </w:r>
-            <w:proofErr w:type="spellEnd"/>
-            <w:r>
-              <w:rPr>
-                <w:b/>
-                <w:spacing w:val="-4"/>
-                <w:w w:val="105"/>
-                <w:sz w:val="28"/>
-              </w:rPr>
-              <w:t>.</w:t>
+              <w:t>Roll.No.</w:t>
             </w:r>
           </w:p>
           <w:p>
@@ -553,7 +540,6 @@
                 <w:sz w:val="28"/>
               </w:rPr>
             </w:pPr>
-            <w:proofErr w:type="spellStart"/>
             <w:r>
               <w:rPr>
                 <w:b/>
@@ -561,17 +547,7 @@
                 <w:w w:val="105"/>
                 <w:sz w:val="28"/>
               </w:rPr>
-              <w:t>Roll.No</w:t>
-            </w:r>
-            <w:proofErr w:type="spellEnd"/>
-            <w:r>
-              <w:rPr>
-                <w:b/>
-                <w:spacing w:val="-4"/>
-                <w:w w:val="105"/>
-                <w:sz w:val="28"/>
-              </w:rPr>
-              <w:t>.</w:t>
+              <w:t>Roll.No.</w:t>
             </w:r>
           </w:p>
           <w:p>
@@ -587,7 +563,6 @@
                 <w:sz w:val="28"/>
               </w:rPr>
             </w:pPr>
-            <w:proofErr w:type="spellStart"/>
             <w:r>
               <w:rPr>
                 <w:b/>
@@ -595,17 +570,7 @@
                 <w:w w:val="105"/>
                 <w:sz w:val="28"/>
               </w:rPr>
-              <w:t>Roll.No</w:t>
-            </w:r>
-            <w:proofErr w:type="spellEnd"/>
-            <w:r>
-              <w:rPr>
-                <w:b/>
-                <w:spacing w:val="-4"/>
-                <w:w w:val="105"/>
-                <w:sz w:val="28"/>
-              </w:rPr>
-              <w:t>.</w:t>
+              <w:t>Roll.No.</w:t>
             </w:r>
           </w:p>
           <w:p>
@@ -621,7 +586,6 @@
                 <w:sz w:val="28"/>
               </w:rPr>
             </w:pPr>
-            <w:proofErr w:type="spellStart"/>
             <w:r>
               <w:rPr>
                 <w:b/>
@@ -629,17 +593,7 @@
                 <w:w w:val="105"/>
                 <w:sz w:val="28"/>
               </w:rPr>
-              <w:t>Roll.No</w:t>
-            </w:r>
-            <w:proofErr w:type="spellEnd"/>
-            <w:r>
-              <w:rPr>
-                <w:b/>
-                <w:spacing w:val="-4"/>
-                <w:w w:val="105"/>
-                <w:sz w:val="28"/>
-              </w:rPr>
-              <w:t>.</w:t>
+              <w:t>Roll.No.</w:t>
             </w:r>
           </w:p>
           <w:p>
@@ -1197,7 +1151,6 @@
         </w:rPr>
         <w:t xml:space="preserve"> </w:t>
       </w:r>
-      <w:proofErr w:type="gramStart"/>
       <w:r>
         <w:rPr>
           <w:spacing w:val="-2"/>
@@ -1216,15 +1169,7 @@
           <w:b/>
           <w:spacing w:val="-2"/>
         </w:rPr>
-        <w:t>(</w:t>
-      </w:r>
-      <w:proofErr w:type="gramEnd"/>
-      <w:r>
-        <w:rPr>
-          <w:b/>
-          <w:spacing w:val="-2"/>
-        </w:rPr>
-        <w:t>2025-26)</w:t>
+        <w:t>(2025-26)</w:t>
       </w:r>
     </w:p>
     <w:p>
@@ -1882,7 +1827,6 @@
               </w:rPr>
               <w:t xml:space="preserve"> </w:t>
             </w:r>
-            <w:proofErr w:type="spellStart"/>
             <w:r>
               <w:rPr>
                 <w:b/>
@@ -1891,7 +1835,6 @@
               </w:rPr>
               <w:t>Ghawali</w:t>
             </w:r>
-            <w:proofErr w:type="spellEnd"/>
           </w:p>
           <w:p>
             <w:pPr>
@@ -1963,7 +1906,6 @@
                 <w:sz w:val="28"/>
               </w:rPr>
             </w:pPr>
-            <w:proofErr w:type="spellStart"/>
             <w:r>
               <w:rPr>
                 <w:b/>
@@ -1971,17 +1913,7 @@
                 <w:w w:val="105"/>
                 <w:sz w:val="28"/>
               </w:rPr>
-              <w:t>Roll.No</w:t>
-            </w:r>
-            <w:proofErr w:type="spellEnd"/>
-            <w:r>
-              <w:rPr>
-                <w:b/>
-                <w:spacing w:val="-4"/>
-                <w:w w:val="105"/>
-                <w:sz w:val="28"/>
-              </w:rPr>
-              <w:t>.</w:t>
+              <w:t>Roll.No.</w:t>
             </w:r>
           </w:p>
           <w:p>
@@ -1997,7 +1929,6 @@
                 <w:sz w:val="28"/>
               </w:rPr>
             </w:pPr>
-            <w:proofErr w:type="spellStart"/>
             <w:r>
               <w:rPr>
                 <w:b/>
@@ -2005,17 +1936,7 @@
                 <w:w w:val="105"/>
                 <w:sz w:val="28"/>
               </w:rPr>
-              <w:t>Roll.No</w:t>
-            </w:r>
-            <w:proofErr w:type="spellEnd"/>
-            <w:r>
-              <w:rPr>
-                <w:b/>
-                <w:spacing w:val="-4"/>
-                <w:w w:val="105"/>
-                <w:sz w:val="28"/>
-              </w:rPr>
-              <w:t>.</w:t>
+              <w:t>Roll.No.</w:t>
             </w:r>
           </w:p>
           <w:p>
@@ -2031,7 +1952,6 @@
                 <w:sz w:val="28"/>
               </w:rPr>
             </w:pPr>
-            <w:proofErr w:type="spellStart"/>
             <w:r>
               <w:rPr>
                 <w:b/>
@@ -2039,17 +1959,7 @@
                 <w:w w:val="105"/>
                 <w:sz w:val="28"/>
               </w:rPr>
-              <w:t>Roll.No</w:t>
-            </w:r>
-            <w:proofErr w:type="spellEnd"/>
-            <w:r>
-              <w:rPr>
-                <w:b/>
-                <w:spacing w:val="-4"/>
-                <w:w w:val="105"/>
-                <w:sz w:val="28"/>
-              </w:rPr>
-              <w:t>.</w:t>
+              <w:t>Roll.No.</w:t>
             </w:r>
           </w:p>
           <w:p>
@@ -2065,7 +1975,6 @@
                 <w:sz w:val="28"/>
               </w:rPr>
             </w:pPr>
-            <w:proofErr w:type="spellStart"/>
             <w:r>
               <w:rPr>
                 <w:b/>
@@ -2073,17 +1982,7 @@
                 <w:w w:val="105"/>
                 <w:sz w:val="28"/>
               </w:rPr>
-              <w:t>Roll.No</w:t>
-            </w:r>
-            <w:proofErr w:type="spellEnd"/>
-            <w:r>
-              <w:rPr>
-                <w:b/>
-                <w:spacing w:val="-4"/>
-                <w:w w:val="105"/>
-                <w:sz w:val="28"/>
-              </w:rPr>
-              <w:t>.</w:t>
+              <w:t>Roll.No.</w:t>
             </w:r>
           </w:p>
           <w:p>
@@ -3063,13 +2962,6 @@
           <w:sz w:val="28"/>
         </w:rPr>
         <w:lastRenderedPageBreak/>
-        <w:t>0</w:t>
-      </w:r>
-      <w:r>
-        <w:rPr>
-          <w:b/>
-          <w:sz w:val="28"/>
-        </w:rPr>
         <w:t>Department</w:t>
       </w:r>
       <w:r>
@@ -3379,23 +3271,14 @@
           <w:sz w:val="28"/>
           <w:szCs w:val="28"/>
         </w:rPr>
-        <w:t xml:space="preserve">Multi-Agent AI Fact-Checking </w:t>
-      </w:r>
-      <w:proofErr w:type="gramStart"/>
+        <w:t>Multi-Agent AI Fact-Checking Syste</w:t>
+      </w:r>
       <w:r>
         <w:rPr>
           <w:color w:val="000000" w:themeColor="text1"/>
           <w:sz w:val="28"/>
           <w:szCs w:val="28"/>
         </w:rPr>
-        <w:t>Syste</w:t>
-      </w:r>
-      <w:r>
-        <w:rPr>
-          <w:color w:val="000000" w:themeColor="text1"/>
-          <w:sz w:val="28"/>
-          <w:szCs w:val="28"/>
-        </w:rPr>
         <w:t xml:space="preserve">m </w:t>
       </w:r>
       <w:r>
@@ -3406,7 +3289,6 @@
         </w:rPr>
         <w:t>”</w:t>
       </w:r>
-      <w:proofErr w:type="gramEnd"/>
     </w:p>
     <w:p>
       <w:pPr>
@@ -3949,17 +3831,8 @@
           <w:szCs w:val="24"/>
         </w:rPr>
         <w:tab/>
-      </w:r>
-      <w:proofErr w:type="spellStart"/>
-      <w:r>
-        <w:rPr>
-          <w:color w:val="000000"/>
-          <w:sz w:val="24"/>
-          <w:szCs w:val="24"/>
-        </w:rPr>
         <w:t>i</w:t>
       </w:r>
-      <w:proofErr w:type="spellEnd"/>
     </w:p>
     <w:p>
       <w:pPr>
@@ -4055,23 +3928,13 @@
         <w:spacing w:after="60" w:line="360" w:lineRule="auto"/>
         <w:ind w:left="440"/>
       </w:pPr>
-      <w:proofErr w:type="gramStart"/>
       <w:r>
         <w:rPr>
           <w:color w:val="000000"/>
           <w:sz w:val="24"/>
           <w:szCs w:val="24"/>
         </w:rPr>
-        <w:t>1.1  Purpose</w:t>
-      </w:r>
-      <w:proofErr w:type="gramEnd"/>
-      <w:r>
-        <w:rPr>
-          <w:color w:val="000000"/>
-          <w:sz w:val="24"/>
-          <w:szCs w:val="24"/>
-        </w:rPr>
-        <w:t xml:space="preserve"> of the Project</w:t>
+        <w:t>1.1  Purpose of the Project</w:t>
       </w:r>
       <w:r>
         <w:rPr>
@@ -4091,23 +3954,13 @@
         <w:spacing w:after="60" w:line="360" w:lineRule="auto"/>
         <w:ind w:left="440"/>
       </w:pPr>
-      <w:proofErr w:type="gramStart"/>
       <w:r>
         <w:rPr>
           <w:color w:val="000000"/>
           <w:sz w:val="24"/>
           <w:szCs w:val="24"/>
         </w:rPr>
-        <w:t>1.2  Scope</w:t>
-      </w:r>
-      <w:proofErr w:type="gramEnd"/>
-      <w:r>
-        <w:rPr>
-          <w:color w:val="000000"/>
-          <w:sz w:val="24"/>
-          <w:szCs w:val="24"/>
-        </w:rPr>
-        <w:t xml:space="preserve"> of the Project</w:t>
+        <w:t>1.2  Scope of the Project</w:t>
       </w:r>
       <w:r>
         <w:rPr>
@@ -4127,23 +3980,21 @@
         <w:spacing w:after="60" w:line="360" w:lineRule="auto"/>
         <w:ind w:left="440"/>
       </w:pPr>
-      <w:proofErr w:type="gramStart"/>
       <w:r>
         <w:rPr>
           <w:color w:val="000000"/>
           <w:sz w:val="24"/>
           <w:szCs w:val="24"/>
         </w:rPr>
-        <w:t>1.3  Functionalities</w:t>
-      </w:r>
-      <w:proofErr w:type="gramEnd"/>
+        <w:t>1.3  Functionalities in the Project</w:t>
+      </w:r>
       <w:r>
         <w:rPr>
           <w:color w:val="000000"/>
           <w:sz w:val="24"/>
           <w:szCs w:val="24"/>
         </w:rPr>
-        <w:t xml:space="preserve"> in the Project</w:t>
+        <w:tab/>
       </w:r>
       <w:r>
         <w:rPr>
@@ -4151,8 +4002,7 @@
           <w:sz w:val="24"/>
           <w:szCs w:val="24"/>
         </w:rPr>
-        <w:tab/>
-        <w:t>5</w:t>
+        <w:t>6</w:t>
       </w:r>
     </w:p>
     <w:p>
@@ -4163,23 +4013,21 @@
         <w:spacing w:after="60" w:line="360" w:lineRule="auto"/>
         <w:ind w:left="440"/>
       </w:pPr>
-      <w:proofErr w:type="gramStart"/>
       <w:r>
         <w:rPr>
           <w:color w:val="000000"/>
           <w:sz w:val="24"/>
           <w:szCs w:val="24"/>
         </w:rPr>
-        <w:t>1.4  Aim</w:t>
-      </w:r>
-      <w:proofErr w:type="gramEnd"/>
+        <w:t>1.4  Aim and Objectives of the Project</w:t>
+      </w:r>
       <w:r>
         <w:rPr>
           <w:color w:val="000000"/>
           <w:sz w:val="24"/>
           <w:szCs w:val="24"/>
         </w:rPr>
-        <w:t xml:space="preserve"> and Objectives of the Project</w:t>
+        <w:tab/>
       </w:r>
       <w:r>
         <w:rPr>
@@ -4187,8 +4035,7 @@
           <w:sz w:val="24"/>
           <w:szCs w:val="24"/>
         </w:rPr>
-        <w:tab/>
-        <w:t>6</w:t>
+        <w:t>8</w:t>
       </w:r>
     </w:p>
     <w:p>
@@ -4224,7 +4071,79 @@
           <w:sz w:val="24"/>
           <w:szCs w:val="24"/>
         </w:rPr>
-        <w:t>7</w:t>
+        <w:t>10</w:t>
+      </w:r>
+    </w:p>
+    <w:p>
+      <w:pPr>
+        <w:tabs>
+          <w:tab w:val="right" w:leader="dot" w:pos="9815"/>
+        </w:tabs>
+        <w:spacing w:before="120" w:after="80" w:line="360" w:lineRule="auto"/>
+      </w:pPr>
+      <w:r>
+        <w:rPr>
+          <w:b/>
+          <w:bCs/>
+          <w:color w:val="000000"/>
+          <w:sz w:val="24"/>
+          <w:szCs w:val="24"/>
+        </w:rPr>
+        <w:t>3.  Planning</w:t>
+      </w:r>
+      <w:r>
+        <w:rPr>
+          <w:color w:val="000000"/>
+          <w:sz w:val="24"/>
+          <w:szCs w:val="24"/>
+        </w:rPr>
+        <w:tab/>
+      </w:r>
+      <w:r>
+        <w:rPr>
+          <w:b/>
+          <w:bCs/>
+          <w:color w:val="000000"/>
+          <w:sz w:val="24"/>
+          <w:szCs w:val="24"/>
+        </w:rPr>
+        <w:t>12</w:t>
+      </w:r>
+    </w:p>
+    <w:p>
+      <w:pPr>
+        <w:tabs>
+          <w:tab w:val="right" w:leader="dot" w:pos="9815"/>
+        </w:tabs>
+        <w:spacing w:before="120" w:after="80" w:line="360" w:lineRule="auto"/>
+      </w:pPr>
+      <w:r>
+        <w:rPr>
+          <w:b/>
+          <w:bCs/>
+          <w:color w:val="000000"/>
+          <w:sz w:val="24"/>
+          <w:szCs w:val="24"/>
+        </w:rPr>
+        <w:t>4.  Methodology</w:t>
+      </w:r>
+      <w:r>
+        <w:rPr>
+          <w:color w:val="000000"/>
+          <w:sz w:val="24"/>
+          <w:szCs w:val="24"/>
+        </w:rPr>
+        <w:tab/>
+      </w:r>
+      <w:r>
+        <w:rPr>
+          <w:b/>
+          <w:bCs/>
+          <w:color w:val="000000"/>
+          <w:sz w:val="24"/>
+          <w:szCs w:val="24"/>
+        </w:rPr>
+        <w:t>14</w:t>
       </w:r>
     </w:p>
     <w:p>
@@ -4235,23 +4154,21 @@
         <w:spacing w:after="60" w:line="360" w:lineRule="auto"/>
         <w:ind w:left="440"/>
       </w:pPr>
-      <w:proofErr w:type="gramStart"/>
       <w:r>
         <w:rPr>
           <w:color w:val="000000"/>
           <w:sz w:val="24"/>
           <w:szCs w:val="24"/>
         </w:rPr>
-        <w:t>2.1  Existing</w:t>
-      </w:r>
-      <w:proofErr w:type="gramEnd"/>
+        <w:t>4.1  Proposed System Overview</w:t>
+      </w:r>
       <w:r>
         <w:rPr>
           <w:color w:val="000000"/>
           <w:sz w:val="24"/>
           <w:szCs w:val="24"/>
         </w:rPr>
-        <w:t xml:space="preserve"> System</w:t>
+        <w:tab/>
       </w:r>
       <w:r>
         <w:rPr>
@@ -4259,8 +4176,7 @@
           <w:sz w:val="24"/>
           <w:szCs w:val="24"/>
         </w:rPr>
-        <w:tab/>
-        <w:t>7</w:t>
+        <w:t>14</w:t>
       </w:r>
     </w:p>
     <w:p>
@@ -4271,23 +4187,22 @@
         <w:spacing w:after="60" w:line="360" w:lineRule="auto"/>
         <w:ind w:left="440"/>
       </w:pPr>
-      <w:proofErr w:type="gramStart"/>
       <w:r>
         <w:rPr>
           <w:color w:val="000000"/>
           <w:sz w:val="24"/>
           <w:szCs w:val="24"/>
         </w:rPr>
-        <w:t>2.2  Proposed</w:t>
-      </w:r>
-      <w:proofErr w:type="gramEnd"/>
+        <w:t>4.2  Algorithm Analysis</w:t>
+      </w:r>
       <w:r>
         <w:rPr>
           <w:color w:val="000000"/>
           <w:sz w:val="24"/>
           <w:szCs w:val="24"/>
         </w:rPr>
-        <w:t xml:space="preserve"> System</w:t>
+        <w:tab/>
+        <w:t>1</w:t>
       </w:r>
       <w:r>
         <w:rPr>
@@ -4295,8 +4210,7 @@
           <w:sz w:val="24"/>
           <w:szCs w:val="24"/>
         </w:rPr>
-        <w:tab/>
-        <w:t>8</w:t>
+        <w:t>6</w:t>
       </w:r>
     </w:p>
     <w:p>
@@ -4307,23 +4221,22 @@
         <w:spacing w:after="60" w:line="360" w:lineRule="auto"/>
         <w:ind w:left="440"/>
       </w:pPr>
-      <w:proofErr w:type="gramStart"/>
       <w:r>
         <w:rPr>
           <w:color w:val="000000"/>
           <w:sz w:val="24"/>
           <w:szCs w:val="24"/>
         </w:rPr>
-        <w:t>2.3  Literature</w:t>
-      </w:r>
-      <w:proofErr w:type="gramEnd"/>
+        <w:t>4.3  System Requirements</w:t>
+      </w:r>
       <w:r>
         <w:rPr>
           <w:color w:val="000000"/>
           <w:sz w:val="24"/>
           <w:szCs w:val="24"/>
         </w:rPr>
-        <w:t xml:space="preserve"> Survey</w:t>
+        <w:tab/>
+        <w:t>1</w:t>
       </w:r>
       <w:r>
         <w:rPr>
@@ -4331,7 +4244,6 @@
           <w:sz w:val="24"/>
           <w:szCs w:val="24"/>
         </w:rPr>
-        <w:tab/>
         <w:t>8</w:t>
       </w:r>
     </w:p>
@@ -4350,7 +4262,7 @@
           <w:sz w:val="24"/>
           <w:szCs w:val="24"/>
         </w:rPr>
-        <w:t>3.  Planning</w:t>
+        <w:t>5.  Design of the System</w:t>
       </w:r>
       <w:r>
         <w:rPr>
@@ -4368,43 +4280,7 @@
           <w:sz w:val="24"/>
           <w:szCs w:val="24"/>
         </w:rPr>
-        <w:t>9</w:t>
-      </w:r>
-    </w:p>
-    <w:p>
-      <w:pPr>
-        <w:tabs>
-          <w:tab w:val="right" w:leader="dot" w:pos="9815"/>
-        </w:tabs>
-        <w:spacing w:before="120" w:after="80" w:line="360" w:lineRule="auto"/>
-      </w:pPr>
-      <w:r>
-        <w:rPr>
-          <w:b/>
-          <w:bCs/>
-          <w:color w:val="000000"/>
-          <w:sz w:val="24"/>
-          <w:szCs w:val="24"/>
-        </w:rPr>
-        <w:t>4.  Methodology</w:t>
-      </w:r>
-      <w:r>
-        <w:rPr>
-          <w:color w:val="000000"/>
-          <w:sz w:val="24"/>
-          <w:szCs w:val="24"/>
-        </w:rPr>
-        <w:tab/>
-      </w:r>
-      <w:r>
-        <w:rPr>
-          <w:b/>
-          <w:bCs/>
-          <w:color w:val="000000"/>
-          <w:sz w:val="24"/>
-          <w:szCs w:val="24"/>
-        </w:rPr>
-        <w:t>10</w:t>
+        <w:t>19</w:t>
       </w:r>
     </w:p>
     <w:p>
@@ -4415,23 +4291,21 @@
         <w:spacing w:after="60" w:line="360" w:lineRule="auto"/>
         <w:ind w:left="440"/>
       </w:pPr>
-      <w:proofErr w:type="gramStart"/>
       <w:r>
         <w:rPr>
           <w:color w:val="000000"/>
           <w:sz w:val="24"/>
           <w:szCs w:val="24"/>
         </w:rPr>
-        <w:t>4.1  Proposed</w:t>
-      </w:r>
-      <w:proofErr w:type="gramEnd"/>
+        <w:t>5.1  Flow Diagram</w:t>
+      </w:r>
       <w:r>
         <w:rPr>
           <w:color w:val="000000"/>
           <w:sz w:val="24"/>
           <w:szCs w:val="24"/>
         </w:rPr>
-        <w:t xml:space="preserve"> System Overview</w:t>
+        <w:tab/>
       </w:r>
       <w:r>
         <w:rPr>
@@ -4439,8 +4313,7 @@
           <w:sz w:val="24"/>
           <w:szCs w:val="24"/>
         </w:rPr>
-        <w:tab/>
-        <w:t>10</w:t>
+        <w:t>19</w:t>
       </w:r>
     </w:p>
     <w:p>
@@ -4451,23 +4324,21 @@
         <w:spacing w:after="60" w:line="360" w:lineRule="auto"/>
         <w:ind w:left="440"/>
       </w:pPr>
-      <w:proofErr w:type="gramStart"/>
       <w:r>
         <w:rPr>
           <w:color w:val="000000"/>
           <w:sz w:val="24"/>
           <w:szCs w:val="24"/>
         </w:rPr>
-        <w:t>4.2  Algorithm</w:t>
-      </w:r>
-      <w:proofErr w:type="gramEnd"/>
+        <w:t>5.2  Use-case Diagram</w:t>
+      </w:r>
       <w:r>
         <w:rPr>
           <w:color w:val="000000"/>
           <w:sz w:val="24"/>
           <w:szCs w:val="24"/>
         </w:rPr>
-        <w:t xml:space="preserve"> Analysis</w:t>
+        <w:tab/>
       </w:r>
       <w:r>
         <w:rPr>
@@ -4475,8 +4346,43 @@
           <w:sz w:val="24"/>
           <w:szCs w:val="24"/>
         </w:rPr>
+        <w:t>20</w:t>
+      </w:r>
+    </w:p>
+    <w:p>
+      <w:pPr>
+        <w:tabs>
+          <w:tab w:val="right" w:leader="dot" w:pos="9815"/>
+        </w:tabs>
+        <w:spacing w:before="120" w:after="80" w:line="360" w:lineRule="auto"/>
+      </w:pPr>
+      <w:r>
+        <w:rPr>
+          <w:b/>
+          <w:bCs/>
+          <w:color w:val="000000"/>
+          <w:sz w:val="24"/>
+          <w:szCs w:val="24"/>
+        </w:rPr>
+        <w:t>6.  Experimental Results</w:t>
+      </w:r>
+      <w:r>
+        <w:rPr>
+          <w:color w:val="000000"/>
+          <w:sz w:val="24"/>
+          <w:szCs w:val="24"/>
+        </w:rPr>
         <w:tab/>
-        <w:t>11</w:t>
+      </w:r>
+      <w:r>
+        <w:rPr>
+          <w:b/>
+          <w:bCs/>
+          <w:color w:val="000000"/>
+          <w:sz w:val="24"/>
+          <w:szCs w:val="24"/>
+        </w:rPr>
+        <w:t>21</w:t>
       </w:r>
     </w:p>
     <w:p>
@@ -4487,23 +4393,21 @@
         <w:spacing w:after="60" w:line="360" w:lineRule="auto"/>
         <w:ind w:left="440"/>
       </w:pPr>
-      <w:proofErr w:type="gramStart"/>
       <w:r>
         <w:rPr>
           <w:color w:val="000000"/>
           <w:sz w:val="24"/>
           <w:szCs w:val="24"/>
         </w:rPr>
-        <w:t>4.3  System</w:t>
-      </w:r>
-      <w:proofErr w:type="gramEnd"/>
+        <w:t>6.1  Outputs / Results</w:t>
+      </w:r>
       <w:r>
         <w:rPr>
           <w:color w:val="000000"/>
           <w:sz w:val="24"/>
           <w:szCs w:val="24"/>
         </w:rPr>
-        <w:t xml:space="preserve"> Requirements</w:t>
+        <w:tab/>
       </w:r>
       <w:r>
         <w:rPr>
@@ -4511,44 +4415,7 @@
           <w:sz w:val="24"/>
           <w:szCs w:val="24"/>
         </w:rPr>
-        <w:tab/>
-        <w:t>11</w:t>
-      </w:r>
-    </w:p>
-    <w:p>
-      <w:pPr>
-        <w:tabs>
-          <w:tab w:val="right" w:leader="dot" w:pos="9815"/>
-        </w:tabs>
-        <w:spacing w:before="120" w:after="80" w:line="360" w:lineRule="auto"/>
-      </w:pPr>
-      <w:r>
-        <w:rPr>
-          <w:b/>
-          <w:bCs/>
-          <w:color w:val="000000"/>
-          <w:sz w:val="24"/>
-          <w:szCs w:val="24"/>
-        </w:rPr>
-        <w:t>5.  Design of the System</w:t>
-      </w:r>
-      <w:r>
-        <w:rPr>
-          <w:color w:val="000000"/>
-          <w:sz w:val="24"/>
-          <w:szCs w:val="24"/>
-        </w:rPr>
-        <w:tab/>
-      </w:r>
-      <w:r>
-        <w:rPr>
-          <w:b/>
-          <w:bCs/>
-          <w:color w:val="000000"/>
-          <w:sz w:val="24"/>
-          <w:szCs w:val="24"/>
-        </w:rPr>
-        <w:t>12</w:t>
+        <w:t>21</w:t>
       </w:r>
     </w:p>
     <w:p>
@@ -4559,23 +4426,21 @@
         <w:spacing w:after="60" w:line="360" w:lineRule="auto"/>
         <w:ind w:left="440"/>
       </w:pPr>
-      <w:proofErr w:type="gramStart"/>
       <w:r>
         <w:rPr>
           <w:color w:val="000000"/>
           <w:sz w:val="24"/>
           <w:szCs w:val="24"/>
         </w:rPr>
-        <w:t>5.1  Flow</w:t>
-      </w:r>
-      <w:proofErr w:type="gramEnd"/>
+        <w:t>6.2  Advantages</w:t>
+      </w:r>
       <w:r>
         <w:rPr>
           <w:color w:val="000000"/>
           <w:sz w:val="24"/>
           <w:szCs w:val="24"/>
         </w:rPr>
-        <w:t xml:space="preserve"> Diagram</w:t>
+        <w:tab/>
       </w:r>
       <w:r>
         <w:rPr>
@@ -4583,8 +4448,7 @@
           <w:sz w:val="24"/>
           <w:szCs w:val="24"/>
         </w:rPr>
-        <w:tab/>
-        <w:t>12</w:t>
+        <w:t>25</w:t>
       </w:r>
     </w:p>
     <w:p>
@@ -4595,23 +4459,21 @@
         <w:spacing w:after="60" w:line="360" w:lineRule="auto"/>
         <w:ind w:left="440"/>
       </w:pPr>
-      <w:proofErr w:type="gramStart"/>
       <w:r>
         <w:rPr>
           <w:color w:val="000000"/>
           <w:sz w:val="24"/>
           <w:szCs w:val="24"/>
         </w:rPr>
-        <w:t>5.2  Use</w:t>
-      </w:r>
-      <w:proofErr w:type="gramEnd"/>
+        <w:t>6.3  Applications</w:t>
+      </w:r>
       <w:r>
         <w:rPr>
           <w:color w:val="000000"/>
           <w:sz w:val="24"/>
           <w:szCs w:val="24"/>
         </w:rPr>
-        <w:t>-case Diagram</w:t>
+        <w:tab/>
       </w:r>
       <w:r>
         <w:rPr>
@@ -4619,8 +4481,7 @@
           <w:sz w:val="24"/>
           <w:szCs w:val="24"/>
         </w:rPr>
-        <w:tab/>
-        <w:t>13</w:t>
+        <w:t>26</w:t>
       </w:r>
     </w:p>
     <w:p>
@@ -4638,7 +4499,7 @@
           <w:sz w:val="24"/>
           <w:szCs w:val="24"/>
         </w:rPr>
-        <w:t>6.  Experimental Results</w:t>
+        <w:t>7.  Conclusion</w:t>
       </w:r>
       <w:r>
         <w:rPr>
@@ -4656,99 +4517,7 @@
           <w:sz w:val="24"/>
           <w:szCs w:val="24"/>
         </w:rPr>
-        <w:t>14</w:t>
-      </w:r>
-    </w:p>
-    <w:p>
-      <w:pPr>
-        <w:tabs>
-          <w:tab w:val="right" w:leader="dot" w:pos="9815"/>
-        </w:tabs>
-        <w:spacing w:after="60" w:line="360" w:lineRule="auto"/>
-        <w:ind w:left="440"/>
-      </w:pPr>
-      <w:proofErr w:type="gramStart"/>
-      <w:r>
-        <w:rPr>
-          <w:color w:val="000000"/>
-          <w:sz w:val="24"/>
-          <w:szCs w:val="24"/>
-        </w:rPr>
-        <w:t>6.1  Outputs</w:t>
-      </w:r>
-      <w:proofErr w:type="gramEnd"/>
-      <w:r>
-        <w:rPr>
-          <w:color w:val="000000"/>
-          <w:sz w:val="24"/>
-          <w:szCs w:val="24"/>
-        </w:rPr>
-        <w:t xml:space="preserve"> / Results</w:t>
-      </w:r>
-      <w:r>
-        <w:rPr>
-          <w:color w:val="000000"/>
-          <w:sz w:val="24"/>
-          <w:szCs w:val="24"/>
-        </w:rPr>
-        <w:tab/>
-        <w:t>14</w:t>
-      </w:r>
-    </w:p>
-    <w:p>
-      <w:pPr>
-        <w:tabs>
-          <w:tab w:val="right" w:leader="dot" w:pos="9815"/>
-        </w:tabs>
-        <w:spacing w:after="60" w:line="360" w:lineRule="auto"/>
-        <w:ind w:left="440"/>
-      </w:pPr>
-      <w:proofErr w:type="gramStart"/>
-      <w:r>
-        <w:rPr>
-          <w:color w:val="000000"/>
-          <w:sz w:val="24"/>
-          <w:szCs w:val="24"/>
-        </w:rPr>
-        <w:t>6.2  Advantages</w:t>
-      </w:r>
-      <w:proofErr w:type="gramEnd"/>
-      <w:r>
-        <w:rPr>
-          <w:color w:val="000000"/>
-          <w:sz w:val="24"/>
-          <w:szCs w:val="24"/>
-        </w:rPr>
-        <w:tab/>
-        <w:t>17</w:t>
-      </w:r>
-    </w:p>
-    <w:p>
-      <w:pPr>
-        <w:tabs>
-          <w:tab w:val="right" w:leader="dot" w:pos="9815"/>
-        </w:tabs>
-        <w:spacing w:after="60" w:line="360" w:lineRule="auto"/>
-        <w:ind w:left="440"/>
-      </w:pPr>
-      <w:proofErr w:type="gramStart"/>
-      <w:r>
-        <w:rPr>
-          <w:color w:val="000000"/>
-          <w:sz w:val="24"/>
-          <w:szCs w:val="24"/>
-        </w:rPr>
-        <w:t>6.3  Applications</w:t>
-      </w:r>
-      <w:proofErr w:type="gramEnd"/>
-      <w:r>
-        <w:rPr>
-          <w:color w:val="000000"/>
-          <w:sz w:val="24"/>
-          <w:szCs w:val="24"/>
-        </w:rPr>
-        <w:tab/>
-        <w:t>18</w:t>
+        <w:t>27</w:t>
       </w:r>
     </w:p>
     <w:p>
@@ -4766,7 +4535,7 @@
           <w:sz w:val="24"/>
           <w:szCs w:val="24"/>
         </w:rPr>
-        <w:t>7.  Conclusion</w:t>
+        <w:t>References</w:t>
       </w:r>
       <w:r>
         <w:rPr>
@@ -4784,16 +4553,8 @@
           <w:sz w:val="24"/>
           <w:szCs w:val="24"/>
         </w:rPr>
-        <w:t>19</w:t>
-      </w:r>
-    </w:p>
-    <w:p>
-      <w:pPr>
-        <w:tabs>
-          <w:tab w:val="right" w:leader="dot" w:pos="9815"/>
-        </w:tabs>
-        <w:spacing w:before="120" w:after="80" w:line="360" w:lineRule="auto"/>
-      </w:pPr>
+        <w:t>2</w:t>
+      </w:r>
       <w:r>
         <w:rPr>
           <w:b/>
@@ -4802,25 +4563,7 @@
           <w:sz w:val="24"/>
           <w:szCs w:val="24"/>
         </w:rPr>
-        <w:t>References</w:t>
-      </w:r>
-      <w:r>
-        <w:rPr>
-          <w:color w:val="000000"/>
-          <w:sz w:val="24"/>
-          <w:szCs w:val="24"/>
-        </w:rPr>
-        <w:tab/>
-      </w:r>
-      <w:r>
-        <w:rPr>
-          <w:b/>
-          <w:bCs/>
-          <w:color w:val="000000"/>
-          <w:sz w:val="24"/>
-          <w:szCs w:val="24"/>
-        </w:rPr>
-        <w:t>20</w:t>
+        <w:t>8</w:t>
       </w:r>
     </w:p>
     <w:sectPr>

</xml_diff>

<commit_message>
The project report decomposed and also the combined project report
</commit_message>
<xml_diff>
--- a/report/insightswarm_content_and_certificate_pages.docx
+++ b/report/insightswarm_content_and_certificate_pages.docx
@@ -656,7 +656,16 @@
                 <w:w w:val="105"/>
                 <w:sz w:val="28"/>
               </w:rPr>
-              <w:t>15</w:t>
+              <w:t>1</w:t>
+            </w:r>
+            <w:r>
+              <w:rPr>
+                <w:b/>
+                <w:spacing w:val="-6"/>
+                <w:w w:val="105"/>
+                <w:sz w:val="28"/>
+              </w:rPr>
+              <w:t>9</w:t>
             </w:r>
           </w:p>
           <w:p>
@@ -702,7 +711,7 @@
                 <w:w w:val="105"/>
                 <w:sz w:val="28"/>
               </w:rPr>
-              <w:t>03</w:t>
+              <w:t>12</w:t>
             </w:r>
           </w:p>
           <w:p>
@@ -2045,7 +2054,16 @@
                 <w:w w:val="105"/>
                 <w:sz w:val="28"/>
               </w:rPr>
-              <w:t>15</w:t>
+              <w:t>1</w:t>
+            </w:r>
+            <w:r>
+              <w:rPr>
+                <w:b/>
+                <w:spacing w:val="-6"/>
+                <w:w w:val="105"/>
+                <w:sz w:val="28"/>
+              </w:rPr>
+              <w:t>9</w:t>
             </w:r>
           </w:p>
           <w:p>
@@ -2091,7 +2109,7 @@
                 <w:w w:val="105"/>
                 <w:sz w:val="28"/>
               </w:rPr>
-              <w:t>03</w:t>
+              <w:t>12</w:t>
             </w:r>
           </w:p>
           <w:p>
@@ -3748,7 +3766,16 @@
         <w:t xml:space="preserve"> </w:t>
       </w:r>
       <w:r>
-        <w:t>03/03/2026</w:t>
+        <w:t>24</w:t>
+      </w:r>
+      <w:r>
+        <w:t>/0</w:t>
+      </w:r>
+      <w:r>
+        <w:t>4</w:t>
+      </w:r>
+      <w:r>
+        <w:t>/2026</w:t>
       </w:r>
     </w:p>
     <w:p>

</xml_diff>